<commit_message>
feat: add personal contribution report and enhance Spark configuration for performance
</commit_message>
<xml_diff>
--- a/Documentation/Architecture Document.docx
+++ b/Documentation/Architecture Document.docx
@@ -5,8 +5,20 @@
     <w:p>
       <w:pPr>
         <w:jc w:val="center"/>
-      </w:pPr>
-      <w:r>
+        <w:rPr>
+          <w:b/>
+          <w:bCs/>
+          <w:sz w:val="32"/>
+          <w:szCs w:val="32"/>
+        </w:rPr>
+      </w:pPr>
+      <w:r>
+        <w:rPr>
+          <w:b/>
+          <w:bCs/>
+          <w:sz w:val="32"/>
+          <w:szCs w:val="32"/>
+        </w:rPr>
         <w:t>System Architecture Diagram</w:t>
       </w:r>
     </w:p>
@@ -33,7 +45,7 @@
                     </pic:cNvPicPr>
                   </pic:nvPicPr>
                   <pic:blipFill>
-                    <a:blip r:embed="rId4">
+                    <a:blip r:embed="rId5">
                       <a:extLst>
                         <a:ext uri="{28A0092B-C50C-407E-A947-70E740481C1C}">
                           <a14:useLocalDpi xmlns:a14="http://schemas.microsoft.com/office/drawing/2010/main" val="0"/>
@@ -68,8 +80,16 @@
     <w:p>
       <w:pPr>
         <w:jc w:val="center"/>
-      </w:pPr>
-      <w:r>
+        <w:rPr>
+          <w:b/>
+          <w:bCs/>
+        </w:rPr>
+      </w:pPr>
+      <w:r>
+        <w:rPr>
+          <w:b/>
+          <w:bCs/>
+        </w:rPr>
         <w:t>Dataflow Diagram</w:t>
       </w:r>
     </w:p>
@@ -96,7 +116,7 @@
                     </pic:cNvPicPr>
                   </pic:nvPicPr>
                   <pic:blipFill>
-                    <a:blip r:embed="rId5">
+                    <a:blip r:embed="rId6">
                       <a:extLst>
                         <a:ext uri="{28A0092B-C50C-407E-A947-70E740481C1C}">
                           <a14:useLocalDpi xmlns:a14="http://schemas.microsoft.com/office/drawing/2010/main" val="0"/>
@@ -131,19 +151,62 @@
     <w:p>
       <w:pPr>
         <w:jc w:val="center"/>
-      </w:pPr>
-      <w:r>
-        <w:t>Technology selection justification</w:t>
-      </w:r>
-    </w:p>
-    <w:p>
-      <w:r>
+        <w:rPr>
+          <w:b/>
+          <w:bCs/>
+        </w:rPr>
+      </w:pPr>
+      <w:r>
+        <w:rPr>
+          <w:b/>
+          <w:bCs/>
+        </w:rPr>
+        <w:t xml:space="preserve">Technology </w:t>
+      </w:r>
+      <w:r>
+        <w:rPr>
+          <w:b/>
+          <w:bCs/>
+        </w:rPr>
+        <w:t>Selection</w:t>
+      </w:r>
+      <w:r>
+        <w:rPr>
+          <w:b/>
+          <w:bCs/>
+        </w:rPr>
+        <w:t xml:space="preserve"> </w:t>
+      </w:r>
+      <w:r>
+        <w:rPr>
+          <w:b/>
+          <w:bCs/>
+        </w:rPr>
+        <w:t>Justification</w:t>
+      </w:r>
+    </w:p>
+    <w:p>
+      <w:pPr>
+        <w:rPr>
+          <w:b/>
+          <w:bCs/>
+        </w:rPr>
+      </w:pPr>
+      <w:r>
+        <w:rPr>
+          <w:b/>
+          <w:bCs/>
+        </w:rPr>
         <w:t>PostgreSQL:</w:t>
       </w:r>
     </w:p>
     <w:p>
       <w:pPr>
-        <w:ind w:firstLine="720"/>
+        <w:pStyle w:val="ListParagraph"/>
+        <w:numPr>
+          <w:ilvl w:val="0"/>
+          <w:numId w:val="1"/>
+        </w:numPr>
       </w:pPr>
       <w:r>
         <w:t>Reliable, ACID-compliant relational storage</w:t>
@@ -151,7 +214,11 @@
     </w:p>
     <w:p>
       <w:pPr>
-        <w:ind w:firstLine="720"/>
+        <w:pStyle w:val="ListParagraph"/>
+        <w:numPr>
+          <w:ilvl w:val="0"/>
+          <w:numId w:val="1"/>
+        </w:numPr>
       </w:pPr>
       <w:r>
         <w:t>Ensures correctness and consistency for fact and dimension tables.</w:t>
@@ -159,7 +226,11 @@
     </w:p>
     <w:p>
       <w:pPr>
-        <w:ind w:firstLine="720"/>
+        <w:pStyle w:val="ListParagraph"/>
+        <w:numPr>
+          <w:ilvl w:val="0"/>
+          <w:numId w:val="1"/>
+        </w:numPr>
       </w:pPr>
       <w:r>
         <w:t>Powerful SQL engine</w:t>
@@ -167,43 +238,409 @@
     </w:p>
     <w:p>
       <w:pPr>
-        <w:ind w:firstLine="720"/>
+        <w:pStyle w:val="ListParagraph"/>
+        <w:numPr>
+          <w:ilvl w:val="0"/>
+          <w:numId w:val="1"/>
+        </w:numPr>
       </w:pPr>
       <w:r>
         <w:t>Ideal for analytics queries, joins, aggregations, and serving BI dashboards.</w:t>
       </w:r>
     </w:p>
     <w:p>
-      <w:r>
+      <w:pPr>
+        <w:rPr>
+          <w:b/>
+          <w:bCs/>
+        </w:rPr>
+      </w:pPr>
+      <w:r>
+        <w:rPr>
+          <w:b/>
+          <w:bCs/>
+        </w:rPr>
         <w:t>Grafana:</w:t>
       </w:r>
     </w:p>
-    <w:p/>
-    <w:p>
-      <w:r>
+    <w:p>
+      <w:pPr>
+        <w:pStyle w:val="ListParagraph"/>
+        <w:numPr>
+          <w:ilvl w:val="0"/>
+          <w:numId w:val="6"/>
+        </w:numPr>
+        <w:rPr>
+          <w:b/>
+          <w:bCs/>
+        </w:rPr>
+      </w:pPr>
+      <w:r>
+        <w:t>Real time visualization with sub-second updates from Kafka metrics.</w:t>
+      </w:r>
+    </w:p>
+    <w:p>
+      <w:pPr>
+        <w:pStyle w:val="ListParagraph"/>
+        <w:numPr>
+          <w:ilvl w:val="0"/>
+          <w:numId w:val="6"/>
+        </w:numPr>
+        <w:rPr>
+          <w:b/>
+          <w:bCs/>
+        </w:rPr>
+      </w:pPr>
+      <w:r>
+        <w:t>Multi-source dashboard</w:t>
+      </w:r>
+    </w:p>
+    <w:p>
+      <w:pPr>
+        <w:pStyle w:val="ListParagraph"/>
+        <w:numPr>
+          <w:ilvl w:val="0"/>
+          <w:numId w:val="6"/>
+        </w:numPr>
+        <w:rPr>
+          <w:b/>
+          <w:bCs/>
+        </w:rPr>
+      </w:pPr>
+      <w:r>
+        <w:t>Pre-built panels, just drag-drop charts</w:t>
+      </w:r>
+    </w:p>
+    <w:p>
+      <w:pPr>
+        <w:pStyle w:val="ListParagraph"/>
+        <w:numPr>
+          <w:ilvl w:val="0"/>
+          <w:numId w:val="6"/>
+        </w:numPr>
+        <w:rPr>
+          <w:b/>
+          <w:bCs/>
+        </w:rPr>
+      </w:pPr>
+      <w:r>
+        <w:t>Open Source</w:t>
+      </w:r>
+    </w:p>
+    <w:p>
+      <w:pPr>
+        <w:tabs>
+          <w:tab w:val="left" w:pos="2022"/>
+        </w:tabs>
+        <w:rPr>
+          <w:b/>
+          <w:bCs/>
+        </w:rPr>
+      </w:pPr>
+      <w:r>
+        <w:rPr>
+          <w:b/>
+          <w:bCs/>
+        </w:rPr>
         <w:t>Prometheus</w:t>
       </w:r>
       <w:r>
+        <w:rPr>
+          <w:b/>
+          <w:bCs/>
+        </w:rPr>
         <w:t>:</w:t>
       </w:r>
-    </w:p>
-    <w:p/>
+      <w:r>
+        <w:rPr>
+          <w:b/>
+          <w:bCs/>
+        </w:rPr>
+        <w:tab/>
+      </w:r>
+    </w:p>
+    <w:p>
+      <w:pPr>
+        <w:pStyle w:val="ListParagraph"/>
+        <w:numPr>
+          <w:ilvl w:val="0"/>
+          <w:numId w:val="7"/>
+        </w:numPr>
+        <w:tabs>
+          <w:tab w:val="left" w:pos="2022"/>
+        </w:tabs>
+      </w:pPr>
+      <w:r>
+        <w:t xml:space="preserve">Time-series </w:t>
+      </w:r>
+      <w:r>
+        <w:t>optimized</w:t>
+      </w:r>
+    </w:p>
+    <w:p>
+      <w:pPr>
+        <w:pStyle w:val="ListParagraph"/>
+        <w:numPr>
+          <w:ilvl w:val="0"/>
+          <w:numId w:val="7"/>
+        </w:numPr>
+        <w:tabs>
+          <w:tab w:val="left" w:pos="2022"/>
+        </w:tabs>
+      </w:pPr>
+      <w:r>
+        <w:lastRenderedPageBreak/>
+        <w:t>Compatible with Grafana since we can easily import Prometheus as a data source in Grafana</w:t>
+      </w:r>
+    </w:p>
+    <w:p>
+      <w:pPr>
+        <w:rPr>
+          <w:b/>
+          <w:bCs/>
+        </w:rPr>
+      </w:pPr>
+    </w:p>
+    <w:p>
+      <w:pPr>
+        <w:rPr>
+          <w:b/>
+          <w:bCs/>
+        </w:rPr>
+      </w:pPr>
+      <w:r>
+        <w:rPr>
+          <w:b/>
+          <w:bCs/>
+        </w:rPr>
+        <w:t>Apache Kafka:</w:t>
+      </w:r>
+    </w:p>
+    <w:p>
+      <w:pPr>
+        <w:pStyle w:val="ListParagraph"/>
+        <w:numPr>
+          <w:ilvl w:val="0"/>
+          <w:numId w:val="2"/>
+        </w:numPr>
+      </w:pPr>
+      <w:r>
+        <w:t>Ability to process mill</w:t>
+      </w:r>
+      <w:r>
+        <w:t>ions of events/</w:t>
+      </w:r>
+      <w:proofErr w:type="gramStart"/>
+      <w:r>
+        <w:t>sec</w:t>
+      </w:r>
+      <w:proofErr w:type="gramEnd"/>
+      <w:r>
+        <w:t xml:space="preserve"> with sub second latency. </w:t>
+      </w:r>
+    </w:p>
+    <w:p>
+      <w:pPr>
+        <w:pStyle w:val="ListParagraph"/>
+        <w:numPr>
+          <w:ilvl w:val="0"/>
+          <w:numId w:val="2"/>
+        </w:numPr>
+      </w:pPr>
+      <w:r>
+        <w:t>Fault-tolerant and Durable</w:t>
+      </w:r>
+    </w:p>
+    <w:p>
+      <w:pPr>
+        <w:pStyle w:val="ListParagraph"/>
+        <w:numPr>
+          <w:ilvl w:val="0"/>
+          <w:numId w:val="2"/>
+        </w:numPr>
+      </w:pPr>
+      <w:r>
+        <w:t>Decouples Producers and Consumers, everything runs independently.</w:t>
+      </w:r>
+    </w:p>
+    <w:p>
+      <w:pPr>
+        <w:pStyle w:val="ListParagraph"/>
+        <w:numPr>
+          <w:ilvl w:val="0"/>
+          <w:numId w:val="2"/>
+        </w:numPr>
+      </w:pPr>
+      <w:r>
+        <w:t>Scalable since we can add brokers/partitions.</w:t>
+      </w:r>
+    </w:p>
+    <w:p>
+      <w:pPr>
+        <w:rPr>
+          <w:b/>
+          <w:bCs/>
+        </w:rPr>
+      </w:pPr>
+      <w:r>
+        <w:rPr>
+          <w:b/>
+          <w:bCs/>
+        </w:rPr>
+        <w:t>Apache Spark Streaming:</w:t>
+      </w:r>
+    </w:p>
+    <w:p>
+      <w:pPr>
+        <w:pStyle w:val="ListParagraph"/>
+        <w:numPr>
+          <w:ilvl w:val="0"/>
+          <w:numId w:val="4"/>
+        </w:numPr>
+      </w:pPr>
+      <w:r>
+        <w:t>Easy to implement.</w:t>
+      </w:r>
+    </w:p>
+    <w:p>
+      <w:pPr>
+        <w:pStyle w:val="ListParagraph"/>
+        <w:numPr>
+          <w:ilvl w:val="0"/>
+          <w:numId w:val="4"/>
+        </w:numPr>
+      </w:pPr>
+      <w:r>
+        <w:t>Rich SQL support</w:t>
+      </w:r>
+    </w:p>
+    <w:p>
+      <w:pPr>
+        <w:pStyle w:val="ListParagraph"/>
+        <w:numPr>
+          <w:ilvl w:val="0"/>
+          <w:numId w:val="4"/>
+        </w:numPr>
+      </w:pPr>
+      <w:r>
+        <w:t>Backpressure handling</w:t>
+      </w:r>
+    </w:p>
+    <w:p>
+      <w:pPr>
+        <w:pStyle w:val="ListParagraph"/>
+        <w:numPr>
+          <w:ilvl w:val="0"/>
+          <w:numId w:val="4"/>
+        </w:numPr>
+      </w:pPr>
+      <w:r>
+        <w:t>Exactly once semantics where there are no duplicates after restarts.</w:t>
+      </w:r>
+    </w:p>
+    <w:p>
+      <w:pPr>
+        <w:pStyle w:val="ListParagraph"/>
+        <w:numPr>
+          <w:ilvl w:val="0"/>
+          <w:numId w:val="4"/>
+        </w:numPr>
+      </w:pPr>
+      <w:r>
+        <w:t>Late data can be handled via watermarking.</w:t>
+      </w:r>
+    </w:p>
+    <w:p>
+      <w:pPr>
+        <w:pStyle w:val="ListParagraph"/>
+        <w:numPr>
+          <w:ilvl w:val="0"/>
+          <w:numId w:val="4"/>
+        </w:numPr>
+      </w:pPr>
+      <w:r>
+        <w:t>Scalable since we can add spark executors and use the same code.</w:t>
+      </w:r>
+    </w:p>
     <w:p>
       <w:pPr>
         <w:jc w:val="center"/>
-      </w:pPr>
-      <w:r>
-        <w:t>Design decisions and trade-offs</w:t>
-      </w:r>
-    </w:p>
-    <w:p>
-      <w:r>
+        <w:rPr>
+          <w:b/>
+          <w:bCs/>
+        </w:rPr>
+      </w:pPr>
+    </w:p>
+    <w:p>
+      <w:pPr>
+        <w:rPr>
+          <w:b/>
+          <w:bCs/>
+        </w:rPr>
+      </w:pPr>
+      <w:r>
+        <w:rPr>
+          <w:b/>
+          <w:bCs/>
+        </w:rPr>
+        <w:br w:type="page"/>
+      </w:r>
+    </w:p>
+    <w:p>
+      <w:pPr>
+        <w:jc w:val="center"/>
+        <w:rPr>
+          <w:b/>
+          <w:bCs/>
+        </w:rPr>
+      </w:pPr>
+      <w:r>
+        <w:rPr>
+          <w:b/>
+          <w:bCs/>
+        </w:rPr>
+        <w:lastRenderedPageBreak/>
+        <w:t xml:space="preserve">Design </w:t>
+      </w:r>
+      <w:r>
+        <w:rPr>
+          <w:b/>
+          <w:bCs/>
+        </w:rPr>
+        <w:t>Decisions</w:t>
+      </w:r>
+      <w:r>
+        <w:rPr>
+          <w:b/>
+          <w:bCs/>
+        </w:rPr>
+        <w:t xml:space="preserve"> and </w:t>
+      </w:r>
+      <w:r>
+        <w:rPr>
+          <w:b/>
+          <w:bCs/>
+        </w:rPr>
+        <w:t>Trade-Offs</w:t>
+      </w:r>
+    </w:p>
+    <w:p>
+      <w:pPr>
+        <w:rPr>
+          <w:b/>
+          <w:bCs/>
+        </w:rPr>
+      </w:pPr>
+      <w:r>
+        <w:rPr>
+          <w:b/>
+          <w:bCs/>
+        </w:rPr>
         <w:t>Deterministic Data Generation:</w:t>
       </w:r>
     </w:p>
     <w:p>
       <w:r>
-        <w:lastRenderedPageBreak/>
         <w:tab/>
         <w:t>+ No need for premade data</w:t>
       </w:r>
@@ -232,9 +669,20 @@
         <w:t>- Bootleg inventory tracking</w:t>
       </w:r>
     </w:p>
-    <w:p>
-      <w:r>
-        <w:t>Use of SCD 2 for Products:</w:t>
+    <w:p/>
+    <w:p>
+      <w:pPr>
+        <w:rPr>
+          <w:b/>
+          <w:bCs/>
+        </w:rPr>
+      </w:pPr>
+      <w:r>
+        <w:rPr>
+          <w:b/>
+          <w:bCs/>
+        </w:rPr>
+        <w:t>Use of SCD Type 2 for Products</w:t>
       </w:r>
     </w:p>
     <w:p>
@@ -253,6 +701,205 @@
       <w:r>
         <w:tab/>
         <w:t>- Slow loading and not the best implementation</w:t>
+      </w:r>
+    </w:p>
+    <w:p/>
+    <w:p>
+      <w:pPr>
+        <w:rPr>
+          <w:b/>
+          <w:bCs/>
+        </w:rPr>
+      </w:pPr>
+      <w:r>
+        <w:rPr>
+          <w:b/>
+          <w:bCs/>
+        </w:rPr>
+        <w:t>Single Spark App:</w:t>
+      </w:r>
+    </w:p>
+    <w:p>
+      <w:r>
+        <w:rPr>
+          <w:b/>
+          <w:bCs/>
+        </w:rPr>
+        <w:tab/>
+      </w:r>
+      <w:r>
+        <w:t xml:space="preserve">+ </w:t>
+      </w:r>
+      <w:r>
+        <w:t>Unified deployment</w:t>
+      </w:r>
+    </w:p>
+    <w:p>
+      <w:r>
+        <w:tab/>
+        <w:t xml:space="preserve">+ Shared </w:t>
+      </w:r>
+      <w:proofErr w:type="spellStart"/>
+      <w:r>
+        <w:t>SparkContext</w:t>
+      </w:r>
+      <w:proofErr w:type="spellEnd"/>
+    </w:p>
+    <w:p>
+      <w:r>
+        <w:tab/>
+      </w:r>
+      <w:r>
+        <w:t xml:space="preserve">- </w:t>
+      </w:r>
+      <w:r>
+        <w:t>Single Point of Failure</w:t>
+      </w:r>
+    </w:p>
+    <w:p>
+      <w:r>
+        <w:tab/>
+        <w:t>- Resource contention</w:t>
+      </w:r>
+    </w:p>
+    <w:p>
+      <w:pPr>
+        <w:rPr>
+          <w:b/>
+          <w:bCs/>
+        </w:rPr>
+      </w:pPr>
+    </w:p>
+    <w:p>
+      <w:r>
+        <w:t>Dedicated Kafka Streams per Pipeline</w:t>
+      </w:r>
+    </w:p>
+    <w:p>
+      <w:r>
+        <w:tab/>
+        <w:t>+ Independ</w:t>
+      </w:r>
+      <w:r>
+        <w:t>ent</w:t>
+      </w:r>
+      <w:r>
+        <w:t xml:space="preserve"> offsets</w:t>
+      </w:r>
+    </w:p>
+    <w:p>
+      <w:r>
+        <w:tab/>
+        <w:t xml:space="preserve">+ Parallel processing </w:t>
+      </w:r>
+    </w:p>
+    <w:p>
+      <w:r>
+        <w:tab/>
+        <w:t xml:space="preserve">- </w:t>
+      </w:r>
+      <w:r>
+        <w:t>Kafka overhead where we have many consumers groups</w:t>
+      </w:r>
+    </w:p>
+    <w:p>
+      <w:r>
+        <w:tab/>
+        <w:t xml:space="preserve">- </w:t>
+      </w:r>
+      <w:r>
+        <w:t>Offset management, checkpoint directories consume more storage</w:t>
+      </w:r>
+    </w:p>
+    <w:p/>
+    <w:p>
+      <w:pPr>
+        <w:rPr>
+          <w:b/>
+          <w:bCs/>
+        </w:rPr>
+      </w:pPr>
+      <w:r>
+        <w:rPr>
+          <w:b/>
+          <w:bCs/>
+        </w:rPr>
+        <w:br w:type="page"/>
+      </w:r>
+    </w:p>
+    <w:p>
+      <w:pPr>
+        <w:rPr>
+          <w:b/>
+          <w:bCs/>
+        </w:rPr>
+      </w:pPr>
+      <w:r>
+        <w:rPr>
+          <w:b/>
+          <w:bCs/>
+        </w:rPr>
+        <w:lastRenderedPageBreak/>
+        <w:t>Dual Sink Pattern (Kafka and Parquet)</w:t>
+      </w:r>
+    </w:p>
+    <w:p>
+      <w:r>
+        <w:tab/>
+        <w:t>+ Writing to disk -&gt; Durability for Batch Jobs</w:t>
+      </w:r>
+    </w:p>
+    <w:p>
+      <w:r>
+        <w:tab/>
+        <w:t xml:space="preserve">+ Kafka real-time </w:t>
+      </w:r>
+      <w:r>
+        <w:sym w:font="Wingdings" w:char="F0E0"/>
+      </w:r>
+      <w:r>
+        <w:t xml:space="preserve"> Dashboard with 10s refresh</w:t>
+      </w:r>
+    </w:p>
+    <w:p>
+      <w:r>
+        <w:tab/>
+        <w:t>+ Decoupled consumers</w:t>
+      </w:r>
+    </w:p>
+    <w:p>
+      <w:r>
+        <w:tab/>
+        <w:t>-</w:t>
+      </w:r>
+      <w:r>
+        <w:t xml:space="preserve"> Double write overhead</w:t>
+      </w:r>
+    </w:p>
+    <w:p>
+      <w:r>
+        <w:tab/>
+        <w:t>- Data Consistency is an issue</w:t>
+      </w:r>
+    </w:p>
+    <w:p>
+      <w:r>
+        <w:tab/>
+      </w:r>
+    </w:p>
+    <w:p>
+      <w:pPr>
+        <w:rPr>
+          <w:b/>
+          <w:bCs/>
+        </w:rPr>
+      </w:pPr>
+    </w:p>
+    <w:p/>
+    <w:p/>
+    <w:p>
+      <w:r>
+        <w:tab/>
       </w:r>
     </w:p>
     <w:p>
@@ -269,6 +916,1167 @@
     </w:sectPr>
   </w:body>
 </w:document>
+</file>
+
+<file path=word/numbering.xml><?xml version="1.0" encoding="utf-8"?>
+<w:numbering xmlns:wpc="http://schemas.microsoft.com/office/word/2010/wordprocessingCanvas" xmlns:cx="http://schemas.microsoft.com/office/drawing/2014/chartex" xmlns:cx1="http://schemas.microsoft.com/office/drawing/2015/9/8/chartex" xmlns:cx2="http://schemas.microsoft.com/office/drawing/2015/10/21/chartex" xmlns:cx3="http://schemas.microsoft.com/office/drawing/2016/5/9/chartex" xmlns:cx4="http://schemas.microsoft.com/office/drawing/2016/5/10/chartex" xmlns:cx5="http://schemas.microsoft.com/office/drawing/2016/5/11/chartex" xmlns:cx6="http://schemas.microsoft.com/office/drawing/2016/5/12/chartex" xmlns:cx7="http://schemas.microsoft.com/office/drawing/2016/5/13/chartex" xmlns:cx8="http://schemas.microsoft.com/office/drawing/2016/5/14/chartex" xmlns:mc="http://schemas.openxmlformats.org/markup-compatibility/2006" xmlns:aink="http://schemas.microsoft.com/office/drawing/2016/ink" xmlns:am3d="http://schemas.microsoft.com/office/drawing/2017/model3d" xmlns:o="urn:schemas-microsoft-com:office:office" xmlns:oel="http://schemas.microsoft.com/office/2019/extlst" xmlns:r="http://schemas.openxmlformats.org/officeDocument/2006/relationships" xmlns:m="http://schemas.openxmlformats.org/officeDocument/2006/math" xmlns:v="urn:schemas-microsoft-com:vml" xmlns:wp14="http://schemas.microsoft.com/office/word/2010/wordprocessingDrawing" xmlns:wp="http://schemas.openxmlformats.org/drawingml/2006/wordprocessingDrawing" xmlns:w10="urn:schemas-microsoft-com:office:word" xmlns:w="http://schemas.openxmlformats.org/wordprocessingml/2006/main" xmlns:w14="http://schemas.microsoft.com/office/word/2010/wordml" xmlns:w15="http://schemas.microsoft.com/office/word/2012/wordml" xmlns:w16cex="http://schemas.microsoft.com/office/word/2018/wordml/cex" xmlns:w16cid="http://schemas.microsoft.com/office/word/2016/wordml/cid" xmlns:w16="http://schemas.microsoft.com/office/word/2018/wordml" xmlns:w16du="http://schemas.microsoft.com/office/word/2023/wordml/word16du" xmlns:w16sdtdh="http://schemas.microsoft.com/office/word/2020/wordml/sdtdatahash" xmlns:w16sdtfl="http://schemas.microsoft.com/office/word/2024/wordml/sdtformatlock" xmlns:w16se="http://schemas.microsoft.com/office/word/2015/wordml/symex" xmlns:wpg="http://schemas.microsoft.com/office/word/2010/wordprocessingGroup" xmlns:wpi="http://schemas.microsoft.com/office/word/2010/wordprocessingInk" xmlns:wne="http://schemas.microsoft.com/office/word/2006/wordml" xmlns:wps="http://schemas.microsoft.com/office/word/2010/wordprocessingShape" mc:Ignorable="w14 w15 w16se w16cid w16 w16cex w16sdtdh w16sdtfl w16du wp14">
+  <w:abstractNum w:abstractNumId="0" w15:restartNumberingAfterBreak="0">
+    <w:nsid w:val="01485342"/>
+    <w:multiLevelType w:val="hybridMultilevel"/>
+    <w:tmpl w:val="923A4C70"/>
+    <w:lvl w:ilvl="0" w:tplc="04090001">
+      <w:start w:val="1"/>
+      <w:numFmt w:val="bullet"/>
+      <w:lvlText w:val=""/>
+      <w:lvlJc w:val="left"/>
+      <w:pPr>
+        <w:ind w:left="720" w:hanging="360"/>
+      </w:pPr>
+      <w:rPr>
+        <w:rFonts w:ascii="Symbol" w:hAnsi="Symbol" w:hint="default"/>
+      </w:rPr>
+    </w:lvl>
+    <w:lvl w:ilvl="1" w:tplc="04090003" w:tentative="1">
+      <w:start w:val="1"/>
+      <w:numFmt w:val="bullet"/>
+      <w:lvlText w:val="o"/>
+      <w:lvlJc w:val="left"/>
+      <w:pPr>
+        <w:ind w:left="1440" w:hanging="360"/>
+      </w:pPr>
+      <w:rPr>
+        <w:rFonts w:ascii="Courier New" w:hAnsi="Courier New" w:cs="Courier New" w:hint="default"/>
+      </w:rPr>
+    </w:lvl>
+    <w:lvl w:ilvl="2" w:tplc="04090005" w:tentative="1">
+      <w:start w:val="1"/>
+      <w:numFmt w:val="bullet"/>
+      <w:lvlText w:val=""/>
+      <w:lvlJc w:val="left"/>
+      <w:pPr>
+        <w:ind w:left="2160" w:hanging="360"/>
+      </w:pPr>
+      <w:rPr>
+        <w:rFonts w:ascii="Wingdings" w:hAnsi="Wingdings" w:hint="default"/>
+      </w:rPr>
+    </w:lvl>
+    <w:lvl w:ilvl="3" w:tplc="04090001" w:tentative="1">
+      <w:start w:val="1"/>
+      <w:numFmt w:val="bullet"/>
+      <w:lvlText w:val=""/>
+      <w:lvlJc w:val="left"/>
+      <w:pPr>
+        <w:ind w:left="2880" w:hanging="360"/>
+      </w:pPr>
+      <w:rPr>
+        <w:rFonts w:ascii="Symbol" w:hAnsi="Symbol" w:hint="default"/>
+      </w:rPr>
+    </w:lvl>
+    <w:lvl w:ilvl="4" w:tplc="04090003" w:tentative="1">
+      <w:start w:val="1"/>
+      <w:numFmt w:val="bullet"/>
+      <w:lvlText w:val="o"/>
+      <w:lvlJc w:val="left"/>
+      <w:pPr>
+        <w:ind w:left="3600" w:hanging="360"/>
+      </w:pPr>
+      <w:rPr>
+        <w:rFonts w:ascii="Courier New" w:hAnsi="Courier New" w:cs="Courier New" w:hint="default"/>
+      </w:rPr>
+    </w:lvl>
+    <w:lvl w:ilvl="5" w:tplc="04090005" w:tentative="1">
+      <w:start w:val="1"/>
+      <w:numFmt w:val="bullet"/>
+      <w:lvlText w:val=""/>
+      <w:lvlJc w:val="left"/>
+      <w:pPr>
+        <w:ind w:left="4320" w:hanging="360"/>
+      </w:pPr>
+      <w:rPr>
+        <w:rFonts w:ascii="Wingdings" w:hAnsi="Wingdings" w:hint="default"/>
+      </w:rPr>
+    </w:lvl>
+    <w:lvl w:ilvl="6" w:tplc="04090001" w:tentative="1">
+      <w:start w:val="1"/>
+      <w:numFmt w:val="bullet"/>
+      <w:lvlText w:val=""/>
+      <w:lvlJc w:val="left"/>
+      <w:pPr>
+        <w:ind w:left="5040" w:hanging="360"/>
+      </w:pPr>
+      <w:rPr>
+        <w:rFonts w:ascii="Symbol" w:hAnsi="Symbol" w:hint="default"/>
+      </w:rPr>
+    </w:lvl>
+    <w:lvl w:ilvl="7" w:tplc="04090003" w:tentative="1">
+      <w:start w:val="1"/>
+      <w:numFmt w:val="bullet"/>
+      <w:lvlText w:val="o"/>
+      <w:lvlJc w:val="left"/>
+      <w:pPr>
+        <w:ind w:left="5760" w:hanging="360"/>
+      </w:pPr>
+      <w:rPr>
+        <w:rFonts w:ascii="Courier New" w:hAnsi="Courier New" w:cs="Courier New" w:hint="default"/>
+      </w:rPr>
+    </w:lvl>
+    <w:lvl w:ilvl="8" w:tplc="04090005" w:tentative="1">
+      <w:start w:val="1"/>
+      <w:numFmt w:val="bullet"/>
+      <w:lvlText w:val=""/>
+      <w:lvlJc w:val="left"/>
+      <w:pPr>
+        <w:ind w:left="6480" w:hanging="360"/>
+      </w:pPr>
+      <w:rPr>
+        <w:rFonts w:ascii="Wingdings" w:hAnsi="Wingdings" w:hint="default"/>
+      </w:rPr>
+    </w:lvl>
+  </w:abstractNum>
+  <w:abstractNum w:abstractNumId="1" w15:restartNumberingAfterBreak="0">
+    <w:nsid w:val="17B35D01"/>
+    <w:multiLevelType w:val="hybridMultilevel"/>
+    <w:tmpl w:val="832E0488"/>
+    <w:lvl w:ilvl="0" w:tplc="04090001">
+      <w:start w:val="1"/>
+      <w:numFmt w:val="bullet"/>
+      <w:lvlText w:val=""/>
+      <w:lvlJc w:val="left"/>
+      <w:pPr>
+        <w:ind w:left="720" w:hanging="360"/>
+      </w:pPr>
+      <w:rPr>
+        <w:rFonts w:ascii="Symbol" w:hAnsi="Symbol" w:hint="default"/>
+      </w:rPr>
+    </w:lvl>
+    <w:lvl w:ilvl="1" w:tplc="04090003" w:tentative="1">
+      <w:start w:val="1"/>
+      <w:numFmt w:val="bullet"/>
+      <w:lvlText w:val="o"/>
+      <w:lvlJc w:val="left"/>
+      <w:pPr>
+        <w:ind w:left="1440" w:hanging="360"/>
+      </w:pPr>
+      <w:rPr>
+        <w:rFonts w:ascii="Courier New" w:hAnsi="Courier New" w:cs="Courier New" w:hint="default"/>
+      </w:rPr>
+    </w:lvl>
+    <w:lvl w:ilvl="2" w:tplc="04090005" w:tentative="1">
+      <w:start w:val="1"/>
+      <w:numFmt w:val="bullet"/>
+      <w:lvlText w:val=""/>
+      <w:lvlJc w:val="left"/>
+      <w:pPr>
+        <w:ind w:left="2160" w:hanging="360"/>
+      </w:pPr>
+      <w:rPr>
+        <w:rFonts w:ascii="Wingdings" w:hAnsi="Wingdings" w:hint="default"/>
+      </w:rPr>
+    </w:lvl>
+    <w:lvl w:ilvl="3" w:tplc="04090001" w:tentative="1">
+      <w:start w:val="1"/>
+      <w:numFmt w:val="bullet"/>
+      <w:lvlText w:val=""/>
+      <w:lvlJc w:val="left"/>
+      <w:pPr>
+        <w:ind w:left="2880" w:hanging="360"/>
+      </w:pPr>
+      <w:rPr>
+        <w:rFonts w:ascii="Symbol" w:hAnsi="Symbol" w:hint="default"/>
+      </w:rPr>
+    </w:lvl>
+    <w:lvl w:ilvl="4" w:tplc="04090003" w:tentative="1">
+      <w:start w:val="1"/>
+      <w:numFmt w:val="bullet"/>
+      <w:lvlText w:val="o"/>
+      <w:lvlJc w:val="left"/>
+      <w:pPr>
+        <w:ind w:left="3600" w:hanging="360"/>
+      </w:pPr>
+      <w:rPr>
+        <w:rFonts w:ascii="Courier New" w:hAnsi="Courier New" w:cs="Courier New" w:hint="default"/>
+      </w:rPr>
+    </w:lvl>
+    <w:lvl w:ilvl="5" w:tplc="04090005" w:tentative="1">
+      <w:start w:val="1"/>
+      <w:numFmt w:val="bullet"/>
+      <w:lvlText w:val=""/>
+      <w:lvlJc w:val="left"/>
+      <w:pPr>
+        <w:ind w:left="4320" w:hanging="360"/>
+      </w:pPr>
+      <w:rPr>
+        <w:rFonts w:ascii="Wingdings" w:hAnsi="Wingdings" w:hint="default"/>
+      </w:rPr>
+    </w:lvl>
+    <w:lvl w:ilvl="6" w:tplc="04090001" w:tentative="1">
+      <w:start w:val="1"/>
+      <w:numFmt w:val="bullet"/>
+      <w:lvlText w:val=""/>
+      <w:lvlJc w:val="left"/>
+      <w:pPr>
+        <w:ind w:left="5040" w:hanging="360"/>
+      </w:pPr>
+      <w:rPr>
+        <w:rFonts w:ascii="Symbol" w:hAnsi="Symbol" w:hint="default"/>
+      </w:rPr>
+    </w:lvl>
+    <w:lvl w:ilvl="7" w:tplc="04090003" w:tentative="1">
+      <w:start w:val="1"/>
+      <w:numFmt w:val="bullet"/>
+      <w:lvlText w:val="o"/>
+      <w:lvlJc w:val="left"/>
+      <w:pPr>
+        <w:ind w:left="5760" w:hanging="360"/>
+      </w:pPr>
+      <w:rPr>
+        <w:rFonts w:ascii="Courier New" w:hAnsi="Courier New" w:cs="Courier New" w:hint="default"/>
+      </w:rPr>
+    </w:lvl>
+    <w:lvl w:ilvl="8" w:tplc="04090005" w:tentative="1">
+      <w:start w:val="1"/>
+      <w:numFmt w:val="bullet"/>
+      <w:lvlText w:val=""/>
+      <w:lvlJc w:val="left"/>
+      <w:pPr>
+        <w:ind w:left="6480" w:hanging="360"/>
+      </w:pPr>
+      <w:rPr>
+        <w:rFonts w:ascii="Wingdings" w:hAnsi="Wingdings" w:hint="default"/>
+      </w:rPr>
+    </w:lvl>
+  </w:abstractNum>
+  <w:abstractNum w:abstractNumId="2" w15:restartNumberingAfterBreak="0">
+    <w:nsid w:val="1DC546B7"/>
+    <w:multiLevelType w:val="hybridMultilevel"/>
+    <w:tmpl w:val="7DF23A30"/>
+    <w:lvl w:ilvl="0" w:tplc="7E12F124">
+      <w:numFmt w:val="bullet"/>
+      <w:lvlText w:val="-"/>
+      <w:lvlJc w:val="left"/>
+      <w:pPr>
+        <w:ind w:left="1080" w:hanging="360"/>
+      </w:pPr>
+      <w:rPr>
+        <w:rFonts w:ascii="Calibri" w:eastAsiaTheme="minorEastAsia" w:hAnsi="Calibri" w:cs="Calibri" w:hint="default"/>
+      </w:rPr>
+    </w:lvl>
+    <w:lvl w:ilvl="1" w:tplc="04090003" w:tentative="1">
+      <w:start w:val="1"/>
+      <w:numFmt w:val="bullet"/>
+      <w:lvlText w:val="o"/>
+      <w:lvlJc w:val="left"/>
+      <w:pPr>
+        <w:ind w:left="1800" w:hanging="360"/>
+      </w:pPr>
+      <w:rPr>
+        <w:rFonts w:ascii="Courier New" w:hAnsi="Courier New" w:cs="Courier New" w:hint="default"/>
+      </w:rPr>
+    </w:lvl>
+    <w:lvl w:ilvl="2" w:tplc="04090005" w:tentative="1">
+      <w:start w:val="1"/>
+      <w:numFmt w:val="bullet"/>
+      <w:lvlText w:val=""/>
+      <w:lvlJc w:val="left"/>
+      <w:pPr>
+        <w:ind w:left="2520" w:hanging="360"/>
+      </w:pPr>
+      <w:rPr>
+        <w:rFonts w:ascii="Wingdings" w:hAnsi="Wingdings" w:hint="default"/>
+      </w:rPr>
+    </w:lvl>
+    <w:lvl w:ilvl="3" w:tplc="04090001" w:tentative="1">
+      <w:start w:val="1"/>
+      <w:numFmt w:val="bullet"/>
+      <w:lvlText w:val=""/>
+      <w:lvlJc w:val="left"/>
+      <w:pPr>
+        <w:ind w:left="3240" w:hanging="360"/>
+      </w:pPr>
+      <w:rPr>
+        <w:rFonts w:ascii="Symbol" w:hAnsi="Symbol" w:hint="default"/>
+      </w:rPr>
+    </w:lvl>
+    <w:lvl w:ilvl="4" w:tplc="04090003" w:tentative="1">
+      <w:start w:val="1"/>
+      <w:numFmt w:val="bullet"/>
+      <w:lvlText w:val="o"/>
+      <w:lvlJc w:val="left"/>
+      <w:pPr>
+        <w:ind w:left="3960" w:hanging="360"/>
+      </w:pPr>
+      <w:rPr>
+        <w:rFonts w:ascii="Courier New" w:hAnsi="Courier New" w:cs="Courier New" w:hint="default"/>
+      </w:rPr>
+    </w:lvl>
+    <w:lvl w:ilvl="5" w:tplc="04090005" w:tentative="1">
+      <w:start w:val="1"/>
+      <w:numFmt w:val="bullet"/>
+      <w:lvlText w:val=""/>
+      <w:lvlJc w:val="left"/>
+      <w:pPr>
+        <w:ind w:left="4680" w:hanging="360"/>
+      </w:pPr>
+      <w:rPr>
+        <w:rFonts w:ascii="Wingdings" w:hAnsi="Wingdings" w:hint="default"/>
+      </w:rPr>
+    </w:lvl>
+    <w:lvl w:ilvl="6" w:tplc="04090001" w:tentative="1">
+      <w:start w:val="1"/>
+      <w:numFmt w:val="bullet"/>
+      <w:lvlText w:val=""/>
+      <w:lvlJc w:val="left"/>
+      <w:pPr>
+        <w:ind w:left="5400" w:hanging="360"/>
+      </w:pPr>
+      <w:rPr>
+        <w:rFonts w:ascii="Symbol" w:hAnsi="Symbol" w:hint="default"/>
+      </w:rPr>
+    </w:lvl>
+    <w:lvl w:ilvl="7" w:tplc="04090003" w:tentative="1">
+      <w:start w:val="1"/>
+      <w:numFmt w:val="bullet"/>
+      <w:lvlText w:val="o"/>
+      <w:lvlJc w:val="left"/>
+      <w:pPr>
+        <w:ind w:left="6120" w:hanging="360"/>
+      </w:pPr>
+      <w:rPr>
+        <w:rFonts w:ascii="Courier New" w:hAnsi="Courier New" w:cs="Courier New" w:hint="default"/>
+      </w:rPr>
+    </w:lvl>
+    <w:lvl w:ilvl="8" w:tplc="04090005" w:tentative="1">
+      <w:start w:val="1"/>
+      <w:numFmt w:val="bullet"/>
+      <w:lvlText w:val=""/>
+      <w:lvlJc w:val="left"/>
+      <w:pPr>
+        <w:ind w:left="6840" w:hanging="360"/>
+      </w:pPr>
+      <w:rPr>
+        <w:rFonts w:ascii="Wingdings" w:hAnsi="Wingdings" w:hint="default"/>
+      </w:rPr>
+    </w:lvl>
+  </w:abstractNum>
+  <w:abstractNum w:abstractNumId="3" w15:restartNumberingAfterBreak="0">
+    <w:nsid w:val="27691602"/>
+    <w:multiLevelType w:val="hybridMultilevel"/>
+    <w:tmpl w:val="18528594"/>
+    <w:lvl w:ilvl="0" w:tplc="04090001">
+      <w:start w:val="1"/>
+      <w:numFmt w:val="bullet"/>
+      <w:lvlText w:val=""/>
+      <w:lvlJc w:val="left"/>
+      <w:pPr>
+        <w:ind w:left="720" w:hanging="360"/>
+      </w:pPr>
+      <w:rPr>
+        <w:rFonts w:ascii="Symbol" w:hAnsi="Symbol" w:hint="default"/>
+      </w:rPr>
+    </w:lvl>
+    <w:lvl w:ilvl="1" w:tplc="04090003" w:tentative="1">
+      <w:start w:val="1"/>
+      <w:numFmt w:val="bullet"/>
+      <w:lvlText w:val="o"/>
+      <w:lvlJc w:val="left"/>
+      <w:pPr>
+        <w:ind w:left="1440" w:hanging="360"/>
+      </w:pPr>
+      <w:rPr>
+        <w:rFonts w:ascii="Courier New" w:hAnsi="Courier New" w:cs="Courier New" w:hint="default"/>
+      </w:rPr>
+    </w:lvl>
+    <w:lvl w:ilvl="2" w:tplc="04090005" w:tentative="1">
+      <w:start w:val="1"/>
+      <w:numFmt w:val="bullet"/>
+      <w:lvlText w:val=""/>
+      <w:lvlJc w:val="left"/>
+      <w:pPr>
+        <w:ind w:left="2160" w:hanging="360"/>
+      </w:pPr>
+      <w:rPr>
+        <w:rFonts w:ascii="Wingdings" w:hAnsi="Wingdings" w:hint="default"/>
+      </w:rPr>
+    </w:lvl>
+    <w:lvl w:ilvl="3" w:tplc="04090001" w:tentative="1">
+      <w:start w:val="1"/>
+      <w:numFmt w:val="bullet"/>
+      <w:lvlText w:val=""/>
+      <w:lvlJc w:val="left"/>
+      <w:pPr>
+        <w:ind w:left="2880" w:hanging="360"/>
+      </w:pPr>
+      <w:rPr>
+        <w:rFonts w:ascii="Symbol" w:hAnsi="Symbol" w:hint="default"/>
+      </w:rPr>
+    </w:lvl>
+    <w:lvl w:ilvl="4" w:tplc="04090003" w:tentative="1">
+      <w:start w:val="1"/>
+      <w:numFmt w:val="bullet"/>
+      <w:lvlText w:val="o"/>
+      <w:lvlJc w:val="left"/>
+      <w:pPr>
+        <w:ind w:left="3600" w:hanging="360"/>
+      </w:pPr>
+      <w:rPr>
+        <w:rFonts w:ascii="Courier New" w:hAnsi="Courier New" w:cs="Courier New" w:hint="default"/>
+      </w:rPr>
+    </w:lvl>
+    <w:lvl w:ilvl="5" w:tplc="04090005" w:tentative="1">
+      <w:start w:val="1"/>
+      <w:numFmt w:val="bullet"/>
+      <w:lvlText w:val=""/>
+      <w:lvlJc w:val="left"/>
+      <w:pPr>
+        <w:ind w:left="4320" w:hanging="360"/>
+      </w:pPr>
+      <w:rPr>
+        <w:rFonts w:ascii="Wingdings" w:hAnsi="Wingdings" w:hint="default"/>
+      </w:rPr>
+    </w:lvl>
+    <w:lvl w:ilvl="6" w:tplc="04090001" w:tentative="1">
+      <w:start w:val="1"/>
+      <w:numFmt w:val="bullet"/>
+      <w:lvlText w:val=""/>
+      <w:lvlJc w:val="left"/>
+      <w:pPr>
+        <w:ind w:left="5040" w:hanging="360"/>
+      </w:pPr>
+      <w:rPr>
+        <w:rFonts w:ascii="Symbol" w:hAnsi="Symbol" w:hint="default"/>
+      </w:rPr>
+    </w:lvl>
+    <w:lvl w:ilvl="7" w:tplc="04090003" w:tentative="1">
+      <w:start w:val="1"/>
+      <w:numFmt w:val="bullet"/>
+      <w:lvlText w:val="o"/>
+      <w:lvlJc w:val="left"/>
+      <w:pPr>
+        <w:ind w:left="5760" w:hanging="360"/>
+      </w:pPr>
+      <w:rPr>
+        <w:rFonts w:ascii="Courier New" w:hAnsi="Courier New" w:cs="Courier New" w:hint="default"/>
+      </w:rPr>
+    </w:lvl>
+    <w:lvl w:ilvl="8" w:tplc="04090005" w:tentative="1">
+      <w:start w:val="1"/>
+      <w:numFmt w:val="bullet"/>
+      <w:lvlText w:val=""/>
+      <w:lvlJc w:val="left"/>
+      <w:pPr>
+        <w:ind w:left="6480" w:hanging="360"/>
+      </w:pPr>
+      <w:rPr>
+        <w:rFonts w:ascii="Wingdings" w:hAnsi="Wingdings" w:hint="default"/>
+      </w:rPr>
+    </w:lvl>
+  </w:abstractNum>
+  <w:abstractNum w:abstractNumId="4" w15:restartNumberingAfterBreak="0">
+    <w:nsid w:val="46AB5BE2"/>
+    <w:multiLevelType w:val="hybridMultilevel"/>
+    <w:tmpl w:val="22CAE786"/>
+    <w:lvl w:ilvl="0" w:tplc="8D1E230E">
+      <w:numFmt w:val="bullet"/>
+      <w:lvlText w:val="-"/>
+      <w:lvlJc w:val="left"/>
+      <w:pPr>
+        <w:ind w:left="1080" w:hanging="360"/>
+      </w:pPr>
+      <w:rPr>
+        <w:rFonts w:ascii="Calibri" w:eastAsiaTheme="minorEastAsia" w:hAnsi="Calibri" w:cs="Calibri" w:hint="default"/>
+      </w:rPr>
+    </w:lvl>
+    <w:lvl w:ilvl="1" w:tplc="04090003" w:tentative="1">
+      <w:start w:val="1"/>
+      <w:numFmt w:val="bullet"/>
+      <w:lvlText w:val="o"/>
+      <w:lvlJc w:val="left"/>
+      <w:pPr>
+        <w:ind w:left="1800" w:hanging="360"/>
+      </w:pPr>
+      <w:rPr>
+        <w:rFonts w:ascii="Courier New" w:hAnsi="Courier New" w:cs="Courier New" w:hint="default"/>
+      </w:rPr>
+    </w:lvl>
+    <w:lvl w:ilvl="2" w:tplc="04090005" w:tentative="1">
+      <w:start w:val="1"/>
+      <w:numFmt w:val="bullet"/>
+      <w:lvlText w:val=""/>
+      <w:lvlJc w:val="left"/>
+      <w:pPr>
+        <w:ind w:left="2520" w:hanging="360"/>
+      </w:pPr>
+      <w:rPr>
+        <w:rFonts w:ascii="Wingdings" w:hAnsi="Wingdings" w:hint="default"/>
+      </w:rPr>
+    </w:lvl>
+    <w:lvl w:ilvl="3" w:tplc="04090001" w:tentative="1">
+      <w:start w:val="1"/>
+      <w:numFmt w:val="bullet"/>
+      <w:lvlText w:val=""/>
+      <w:lvlJc w:val="left"/>
+      <w:pPr>
+        <w:ind w:left="3240" w:hanging="360"/>
+      </w:pPr>
+      <w:rPr>
+        <w:rFonts w:ascii="Symbol" w:hAnsi="Symbol" w:hint="default"/>
+      </w:rPr>
+    </w:lvl>
+    <w:lvl w:ilvl="4" w:tplc="04090003" w:tentative="1">
+      <w:start w:val="1"/>
+      <w:numFmt w:val="bullet"/>
+      <w:lvlText w:val="o"/>
+      <w:lvlJc w:val="left"/>
+      <w:pPr>
+        <w:ind w:left="3960" w:hanging="360"/>
+      </w:pPr>
+      <w:rPr>
+        <w:rFonts w:ascii="Courier New" w:hAnsi="Courier New" w:cs="Courier New" w:hint="default"/>
+      </w:rPr>
+    </w:lvl>
+    <w:lvl w:ilvl="5" w:tplc="04090005" w:tentative="1">
+      <w:start w:val="1"/>
+      <w:numFmt w:val="bullet"/>
+      <w:lvlText w:val=""/>
+      <w:lvlJc w:val="left"/>
+      <w:pPr>
+        <w:ind w:left="4680" w:hanging="360"/>
+      </w:pPr>
+      <w:rPr>
+        <w:rFonts w:ascii="Wingdings" w:hAnsi="Wingdings" w:hint="default"/>
+      </w:rPr>
+    </w:lvl>
+    <w:lvl w:ilvl="6" w:tplc="04090001" w:tentative="1">
+      <w:start w:val="1"/>
+      <w:numFmt w:val="bullet"/>
+      <w:lvlText w:val=""/>
+      <w:lvlJc w:val="left"/>
+      <w:pPr>
+        <w:ind w:left="5400" w:hanging="360"/>
+      </w:pPr>
+      <w:rPr>
+        <w:rFonts w:ascii="Symbol" w:hAnsi="Symbol" w:hint="default"/>
+      </w:rPr>
+    </w:lvl>
+    <w:lvl w:ilvl="7" w:tplc="04090003" w:tentative="1">
+      <w:start w:val="1"/>
+      <w:numFmt w:val="bullet"/>
+      <w:lvlText w:val="o"/>
+      <w:lvlJc w:val="left"/>
+      <w:pPr>
+        <w:ind w:left="6120" w:hanging="360"/>
+      </w:pPr>
+      <w:rPr>
+        <w:rFonts w:ascii="Courier New" w:hAnsi="Courier New" w:cs="Courier New" w:hint="default"/>
+      </w:rPr>
+    </w:lvl>
+    <w:lvl w:ilvl="8" w:tplc="04090005" w:tentative="1">
+      <w:start w:val="1"/>
+      <w:numFmt w:val="bullet"/>
+      <w:lvlText w:val=""/>
+      <w:lvlJc w:val="left"/>
+      <w:pPr>
+        <w:ind w:left="6840" w:hanging="360"/>
+      </w:pPr>
+      <w:rPr>
+        <w:rFonts w:ascii="Wingdings" w:hAnsi="Wingdings" w:hint="default"/>
+      </w:rPr>
+    </w:lvl>
+  </w:abstractNum>
+  <w:abstractNum w:abstractNumId="5" w15:restartNumberingAfterBreak="0">
+    <w:nsid w:val="473344F1"/>
+    <w:multiLevelType w:val="hybridMultilevel"/>
+    <w:tmpl w:val="4120DC66"/>
+    <w:lvl w:ilvl="0" w:tplc="04090001">
+      <w:start w:val="1"/>
+      <w:numFmt w:val="bullet"/>
+      <w:lvlText w:val=""/>
+      <w:lvlJc w:val="left"/>
+      <w:pPr>
+        <w:ind w:left="720" w:hanging="360"/>
+      </w:pPr>
+      <w:rPr>
+        <w:rFonts w:ascii="Symbol" w:hAnsi="Symbol" w:hint="default"/>
+      </w:rPr>
+    </w:lvl>
+    <w:lvl w:ilvl="1" w:tplc="04090003" w:tentative="1">
+      <w:start w:val="1"/>
+      <w:numFmt w:val="bullet"/>
+      <w:lvlText w:val="o"/>
+      <w:lvlJc w:val="left"/>
+      <w:pPr>
+        <w:ind w:left="1440" w:hanging="360"/>
+      </w:pPr>
+      <w:rPr>
+        <w:rFonts w:ascii="Courier New" w:hAnsi="Courier New" w:cs="Courier New" w:hint="default"/>
+      </w:rPr>
+    </w:lvl>
+    <w:lvl w:ilvl="2" w:tplc="04090005" w:tentative="1">
+      <w:start w:val="1"/>
+      <w:numFmt w:val="bullet"/>
+      <w:lvlText w:val=""/>
+      <w:lvlJc w:val="left"/>
+      <w:pPr>
+        <w:ind w:left="2160" w:hanging="360"/>
+      </w:pPr>
+      <w:rPr>
+        <w:rFonts w:ascii="Wingdings" w:hAnsi="Wingdings" w:hint="default"/>
+      </w:rPr>
+    </w:lvl>
+    <w:lvl w:ilvl="3" w:tplc="04090001" w:tentative="1">
+      <w:start w:val="1"/>
+      <w:numFmt w:val="bullet"/>
+      <w:lvlText w:val=""/>
+      <w:lvlJc w:val="left"/>
+      <w:pPr>
+        <w:ind w:left="2880" w:hanging="360"/>
+      </w:pPr>
+      <w:rPr>
+        <w:rFonts w:ascii="Symbol" w:hAnsi="Symbol" w:hint="default"/>
+      </w:rPr>
+    </w:lvl>
+    <w:lvl w:ilvl="4" w:tplc="04090003" w:tentative="1">
+      <w:start w:val="1"/>
+      <w:numFmt w:val="bullet"/>
+      <w:lvlText w:val="o"/>
+      <w:lvlJc w:val="left"/>
+      <w:pPr>
+        <w:ind w:left="3600" w:hanging="360"/>
+      </w:pPr>
+      <w:rPr>
+        <w:rFonts w:ascii="Courier New" w:hAnsi="Courier New" w:cs="Courier New" w:hint="default"/>
+      </w:rPr>
+    </w:lvl>
+    <w:lvl w:ilvl="5" w:tplc="04090005" w:tentative="1">
+      <w:start w:val="1"/>
+      <w:numFmt w:val="bullet"/>
+      <w:lvlText w:val=""/>
+      <w:lvlJc w:val="left"/>
+      <w:pPr>
+        <w:ind w:left="4320" w:hanging="360"/>
+      </w:pPr>
+      <w:rPr>
+        <w:rFonts w:ascii="Wingdings" w:hAnsi="Wingdings" w:hint="default"/>
+      </w:rPr>
+    </w:lvl>
+    <w:lvl w:ilvl="6" w:tplc="04090001" w:tentative="1">
+      <w:start w:val="1"/>
+      <w:numFmt w:val="bullet"/>
+      <w:lvlText w:val=""/>
+      <w:lvlJc w:val="left"/>
+      <w:pPr>
+        <w:ind w:left="5040" w:hanging="360"/>
+      </w:pPr>
+      <w:rPr>
+        <w:rFonts w:ascii="Symbol" w:hAnsi="Symbol" w:hint="default"/>
+      </w:rPr>
+    </w:lvl>
+    <w:lvl w:ilvl="7" w:tplc="04090003" w:tentative="1">
+      <w:start w:val="1"/>
+      <w:numFmt w:val="bullet"/>
+      <w:lvlText w:val="o"/>
+      <w:lvlJc w:val="left"/>
+      <w:pPr>
+        <w:ind w:left="5760" w:hanging="360"/>
+      </w:pPr>
+      <w:rPr>
+        <w:rFonts w:ascii="Courier New" w:hAnsi="Courier New" w:cs="Courier New" w:hint="default"/>
+      </w:rPr>
+    </w:lvl>
+    <w:lvl w:ilvl="8" w:tplc="04090005" w:tentative="1">
+      <w:start w:val="1"/>
+      <w:numFmt w:val="bullet"/>
+      <w:lvlText w:val=""/>
+      <w:lvlJc w:val="left"/>
+      <w:pPr>
+        <w:ind w:left="6480" w:hanging="360"/>
+      </w:pPr>
+      <w:rPr>
+        <w:rFonts w:ascii="Wingdings" w:hAnsi="Wingdings" w:hint="default"/>
+      </w:rPr>
+    </w:lvl>
+  </w:abstractNum>
+  <w:abstractNum w:abstractNumId="6" w15:restartNumberingAfterBreak="0">
+    <w:nsid w:val="56802F84"/>
+    <w:multiLevelType w:val="hybridMultilevel"/>
+    <w:tmpl w:val="EA92A1B6"/>
+    <w:lvl w:ilvl="0" w:tplc="7386808C">
+      <w:numFmt w:val="bullet"/>
+      <w:lvlText w:val="-"/>
+      <w:lvlJc w:val="left"/>
+      <w:pPr>
+        <w:ind w:left="1080" w:hanging="360"/>
+      </w:pPr>
+      <w:rPr>
+        <w:rFonts w:ascii="Calibri" w:eastAsiaTheme="minorEastAsia" w:hAnsi="Calibri" w:cs="Calibri" w:hint="default"/>
+      </w:rPr>
+    </w:lvl>
+    <w:lvl w:ilvl="1" w:tplc="04090003" w:tentative="1">
+      <w:start w:val="1"/>
+      <w:numFmt w:val="bullet"/>
+      <w:lvlText w:val="o"/>
+      <w:lvlJc w:val="left"/>
+      <w:pPr>
+        <w:ind w:left="1800" w:hanging="360"/>
+      </w:pPr>
+      <w:rPr>
+        <w:rFonts w:ascii="Courier New" w:hAnsi="Courier New" w:cs="Courier New" w:hint="default"/>
+      </w:rPr>
+    </w:lvl>
+    <w:lvl w:ilvl="2" w:tplc="04090005" w:tentative="1">
+      <w:start w:val="1"/>
+      <w:numFmt w:val="bullet"/>
+      <w:lvlText w:val=""/>
+      <w:lvlJc w:val="left"/>
+      <w:pPr>
+        <w:ind w:left="2520" w:hanging="360"/>
+      </w:pPr>
+      <w:rPr>
+        <w:rFonts w:ascii="Wingdings" w:hAnsi="Wingdings" w:hint="default"/>
+      </w:rPr>
+    </w:lvl>
+    <w:lvl w:ilvl="3" w:tplc="04090001" w:tentative="1">
+      <w:start w:val="1"/>
+      <w:numFmt w:val="bullet"/>
+      <w:lvlText w:val=""/>
+      <w:lvlJc w:val="left"/>
+      <w:pPr>
+        <w:ind w:left="3240" w:hanging="360"/>
+      </w:pPr>
+      <w:rPr>
+        <w:rFonts w:ascii="Symbol" w:hAnsi="Symbol" w:hint="default"/>
+      </w:rPr>
+    </w:lvl>
+    <w:lvl w:ilvl="4" w:tplc="04090003" w:tentative="1">
+      <w:start w:val="1"/>
+      <w:numFmt w:val="bullet"/>
+      <w:lvlText w:val="o"/>
+      <w:lvlJc w:val="left"/>
+      <w:pPr>
+        <w:ind w:left="3960" w:hanging="360"/>
+      </w:pPr>
+      <w:rPr>
+        <w:rFonts w:ascii="Courier New" w:hAnsi="Courier New" w:cs="Courier New" w:hint="default"/>
+      </w:rPr>
+    </w:lvl>
+    <w:lvl w:ilvl="5" w:tplc="04090005" w:tentative="1">
+      <w:start w:val="1"/>
+      <w:numFmt w:val="bullet"/>
+      <w:lvlText w:val=""/>
+      <w:lvlJc w:val="left"/>
+      <w:pPr>
+        <w:ind w:left="4680" w:hanging="360"/>
+      </w:pPr>
+      <w:rPr>
+        <w:rFonts w:ascii="Wingdings" w:hAnsi="Wingdings" w:hint="default"/>
+      </w:rPr>
+    </w:lvl>
+    <w:lvl w:ilvl="6" w:tplc="04090001" w:tentative="1">
+      <w:start w:val="1"/>
+      <w:numFmt w:val="bullet"/>
+      <w:lvlText w:val=""/>
+      <w:lvlJc w:val="left"/>
+      <w:pPr>
+        <w:ind w:left="5400" w:hanging="360"/>
+      </w:pPr>
+      <w:rPr>
+        <w:rFonts w:ascii="Symbol" w:hAnsi="Symbol" w:hint="default"/>
+      </w:rPr>
+    </w:lvl>
+    <w:lvl w:ilvl="7" w:tplc="04090003" w:tentative="1">
+      <w:start w:val="1"/>
+      <w:numFmt w:val="bullet"/>
+      <w:lvlText w:val="o"/>
+      <w:lvlJc w:val="left"/>
+      <w:pPr>
+        <w:ind w:left="6120" w:hanging="360"/>
+      </w:pPr>
+      <w:rPr>
+        <w:rFonts w:ascii="Courier New" w:hAnsi="Courier New" w:cs="Courier New" w:hint="default"/>
+      </w:rPr>
+    </w:lvl>
+    <w:lvl w:ilvl="8" w:tplc="04090005" w:tentative="1">
+      <w:start w:val="1"/>
+      <w:numFmt w:val="bullet"/>
+      <w:lvlText w:val=""/>
+      <w:lvlJc w:val="left"/>
+      <w:pPr>
+        <w:ind w:left="6840" w:hanging="360"/>
+      </w:pPr>
+      <w:rPr>
+        <w:rFonts w:ascii="Wingdings" w:hAnsi="Wingdings" w:hint="default"/>
+      </w:rPr>
+    </w:lvl>
+  </w:abstractNum>
+  <w:abstractNum w:abstractNumId="7" w15:restartNumberingAfterBreak="0">
+    <w:nsid w:val="600A2060"/>
+    <w:multiLevelType w:val="hybridMultilevel"/>
+    <w:tmpl w:val="91C84926"/>
+    <w:lvl w:ilvl="0" w:tplc="04090001">
+      <w:start w:val="1"/>
+      <w:numFmt w:val="bullet"/>
+      <w:lvlText w:val=""/>
+      <w:lvlJc w:val="left"/>
+      <w:pPr>
+        <w:ind w:left="720" w:hanging="360"/>
+      </w:pPr>
+      <w:rPr>
+        <w:rFonts w:ascii="Symbol" w:hAnsi="Symbol" w:hint="default"/>
+      </w:rPr>
+    </w:lvl>
+    <w:lvl w:ilvl="1" w:tplc="04090003" w:tentative="1">
+      <w:start w:val="1"/>
+      <w:numFmt w:val="bullet"/>
+      <w:lvlText w:val="o"/>
+      <w:lvlJc w:val="left"/>
+      <w:pPr>
+        <w:ind w:left="1440" w:hanging="360"/>
+      </w:pPr>
+      <w:rPr>
+        <w:rFonts w:ascii="Courier New" w:hAnsi="Courier New" w:cs="Courier New" w:hint="default"/>
+      </w:rPr>
+    </w:lvl>
+    <w:lvl w:ilvl="2" w:tplc="04090005" w:tentative="1">
+      <w:start w:val="1"/>
+      <w:numFmt w:val="bullet"/>
+      <w:lvlText w:val=""/>
+      <w:lvlJc w:val="left"/>
+      <w:pPr>
+        <w:ind w:left="2160" w:hanging="360"/>
+      </w:pPr>
+      <w:rPr>
+        <w:rFonts w:ascii="Wingdings" w:hAnsi="Wingdings" w:hint="default"/>
+      </w:rPr>
+    </w:lvl>
+    <w:lvl w:ilvl="3" w:tplc="04090001" w:tentative="1">
+      <w:start w:val="1"/>
+      <w:numFmt w:val="bullet"/>
+      <w:lvlText w:val=""/>
+      <w:lvlJc w:val="left"/>
+      <w:pPr>
+        <w:ind w:left="2880" w:hanging="360"/>
+      </w:pPr>
+      <w:rPr>
+        <w:rFonts w:ascii="Symbol" w:hAnsi="Symbol" w:hint="default"/>
+      </w:rPr>
+    </w:lvl>
+    <w:lvl w:ilvl="4" w:tplc="04090003" w:tentative="1">
+      <w:start w:val="1"/>
+      <w:numFmt w:val="bullet"/>
+      <w:lvlText w:val="o"/>
+      <w:lvlJc w:val="left"/>
+      <w:pPr>
+        <w:ind w:left="3600" w:hanging="360"/>
+      </w:pPr>
+      <w:rPr>
+        <w:rFonts w:ascii="Courier New" w:hAnsi="Courier New" w:cs="Courier New" w:hint="default"/>
+      </w:rPr>
+    </w:lvl>
+    <w:lvl w:ilvl="5" w:tplc="04090005" w:tentative="1">
+      <w:start w:val="1"/>
+      <w:numFmt w:val="bullet"/>
+      <w:lvlText w:val=""/>
+      <w:lvlJc w:val="left"/>
+      <w:pPr>
+        <w:ind w:left="4320" w:hanging="360"/>
+      </w:pPr>
+      <w:rPr>
+        <w:rFonts w:ascii="Wingdings" w:hAnsi="Wingdings" w:hint="default"/>
+      </w:rPr>
+    </w:lvl>
+    <w:lvl w:ilvl="6" w:tplc="04090001" w:tentative="1">
+      <w:start w:val="1"/>
+      <w:numFmt w:val="bullet"/>
+      <w:lvlText w:val=""/>
+      <w:lvlJc w:val="left"/>
+      <w:pPr>
+        <w:ind w:left="5040" w:hanging="360"/>
+      </w:pPr>
+      <w:rPr>
+        <w:rFonts w:ascii="Symbol" w:hAnsi="Symbol" w:hint="default"/>
+      </w:rPr>
+    </w:lvl>
+    <w:lvl w:ilvl="7" w:tplc="04090003" w:tentative="1">
+      <w:start w:val="1"/>
+      <w:numFmt w:val="bullet"/>
+      <w:lvlText w:val="o"/>
+      <w:lvlJc w:val="left"/>
+      <w:pPr>
+        <w:ind w:left="5760" w:hanging="360"/>
+      </w:pPr>
+      <w:rPr>
+        <w:rFonts w:ascii="Courier New" w:hAnsi="Courier New" w:cs="Courier New" w:hint="default"/>
+      </w:rPr>
+    </w:lvl>
+    <w:lvl w:ilvl="8" w:tplc="04090005" w:tentative="1">
+      <w:start w:val="1"/>
+      <w:numFmt w:val="bullet"/>
+      <w:lvlText w:val=""/>
+      <w:lvlJc w:val="left"/>
+      <w:pPr>
+        <w:ind w:left="6480" w:hanging="360"/>
+      </w:pPr>
+      <w:rPr>
+        <w:rFonts w:ascii="Wingdings" w:hAnsi="Wingdings" w:hint="default"/>
+      </w:rPr>
+    </w:lvl>
+  </w:abstractNum>
+  <w:abstractNum w:abstractNumId="8" w15:restartNumberingAfterBreak="0">
+    <w:nsid w:val="639C1FBD"/>
+    <w:multiLevelType w:val="hybridMultilevel"/>
+    <w:tmpl w:val="AAAC25C4"/>
+    <w:lvl w:ilvl="0" w:tplc="04090001">
+      <w:start w:val="1"/>
+      <w:numFmt w:val="bullet"/>
+      <w:lvlText w:val=""/>
+      <w:lvlJc w:val="left"/>
+      <w:pPr>
+        <w:ind w:left="720" w:hanging="360"/>
+      </w:pPr>
+      <w:rPr>
+        <w:rFonts w:ascii="Symbol" w:hAnsi="Symbol" w:hint="default"/>
+      </w:rPr>
+    </w:lvl>
+    <w:lvl w:ilvl="1" w:tplc="04090003" w:tentative="1">
+      <w:start w:val="1"/>
+      <w:numFmt w:val="bullet"/>
+      <w:lvlText w:val="o"/>
+      <w:lvlJc w:val="left"/>
+      <w:pPr>
+        <w:ind w:left="1440" w:hanging="360"/>
+      </w:pPr>
+      <w:rPr>
+        <w:rFonts w:ascii="Courier New" w:hAnsi="Courier New" w:cs="Courier New" w:hint="default"/>
+      </w:rPr>
+    </w:lvl>
+    <w:lvl w:ilvl="2" w:tplc="04090005" w:tentative="1">
+      <w:start w:val="1"/>
+      <w:numFmt w:val="bullet"/>
+      <w:lvlText w:val=""/>
+      <w:lvlJc w:val="left"/>
+      <w:pPr>
+        <w:ind w:left="2160" w:hanging="360"/>
+      </w:pPr>
+      <w:rPr>
+        <w:rFonts w:ascii="Wingdings" w:hAnsi="Wingdings" w:hint="default"/>
+      </w:rPr>
+    </w:lvl>
+    <w:lvl w:ilvl="3" w:tplc="04090001" w:tentative="1">
+      <w:start w:val="1"/>
+      <w:numFmt w:val="bullet"/>
+      <w:lvlText w:val=""/>
+      <w:lvlJc w:val="left"/>
+      <w:pPr>
+        <w:ind w:left="2880" w:hanging="360"/>
+      </w:pPr>
+      <w:rPr>
+        <w:rFonts w:ascii="Symbol" w:hAnsi="Symbol" w:hint="default"/>
+      </w:rPr>
+    </w:lvl>
+    <w:lvl w:ilvl="4" w:tplc="04090003" w:tentative="1">
+      <w:start w:val="1"/>
+      <w:numFmt w:val="bullet"/>
+      <w:lvlText w:val="o"/>
+      <w:lvlJc w:val="left"/>
+      <w:pPr>
+        <w:ind w:left="3600" w:hanging="360"/>
+      </w:pPr>
+      <w:rPr>
+        <w:rFonts w:ascii="Courier New" w:hAnsi="Courier New" w:cs="Courier New" w:hint="default"/>
+      </w:rPr>
+    </w:lvl>
+    <w:lvl w:ilvl="5" w:tplc="04090005" w:tentative="1">
+      <w:start w:val="1"/>
+      <w:numFmt w:val="bullet"/>
+      <w:lvlText w:val=""/>
+      <w:lvlJc w:val="left"/>
+      <w:pPr>
+        <w:ind w:left="4320" w:hanging="360"/>
+      </w:pPr>
+      <w:rPr>
+        <w:rFonts w:ascii="Wingdings" w:hAnsi="Wingdings" w:hint="default"/>
+      </w:rPr>
+    </w:lvl>
+    <w:lvl w:ilvl="6" w:tplc="04090001" w:tentative="1">
+      <w:start w:val="1"/>
+      <w:numFmt w:val="bullet"/>
+      <w:lvlText w:val=""/>
+      <w:lvlJc w:val="left"/>
+      <w:pPr>
+        <w:ind w:left="5040" w:hanging="360"/>
+      </w:pPr>
+      <w:rPr>
+        <w:rFonts w:ascii="Symbol" w:hAnsi="Symbol" w:hint="default"/>
+      </w:rPr>
+    </w:lvl>
+    <w:lvl w:ilvl="7" w:tplc="04090003" w:tentative="1">
+      <w:start w:val="1"/>
+      <w:numFmt w:val="bullet"/>
+      <w:lvlText w:val="o"/>
+      <w:lvlJc w:val="left"/>
+      <w:pPr>
+        <w:ind w:left="5760" w:hanging="360"/>
+      </w:pPr>
+      <w:rPr>
+        <w:rFonts w:ascii="Courier New" w:hAnsi="Courier New" w:cs="Courier New" w:hint="default"/>
+      </w:rPr>
+    </w:lvl>
+    <w:lvl w:ilvl="8" w:tplc="04090005" w:tentative="1">
+      <w:start w:val="1"/>
+      <w:numFmt w:val="bullet"/>
+      <w:lvlText w:val=""/>
+      <w:lvlJc w:val="left"/>
+      <w:pPr>
+        <w:ind w:left="6480" w:hanging="360"/>
+      </w:pPr>
+      <w:rPr>
+        <w:rFonts w:ascii="Wingdings" w:hAnsi="Wingdings" w:hint="default"/>
+      </w:rPr>
+    </w:lvl>
+  </w:abstractNum>
+  <w:abstractNum w:abstractNumId="9" w15:restartNumberingAfterBreak="0">
+    <w:nsid w:val="7E1A0599"/>
+    <w:multiLevelType w:val="hybridMultilevel"/>
+    <w:tmpl w:val="5F2E058C"/>
+    <w:lvl w:ilvl="0" w:tplc="DC5C5AD6">
+      <w:numFmt w:val="bullet"/>
+      <w:lvlText w:val="-"/>
+      <w:lvlJc w:val="left"/>
+      <w:pPr>
+        <w:ind w:left="1080" w:hanging="360"/>
+      </w:pPr>
+      <w:rPr>
+        <w:rFonts w:ascii="Calibri" w:eastAsiaTheme="minorEastAsia" w:hAnsi="Calibri" w:cs="Calibri" w:hint="default"/>
+      </w:rPr>
+    </w:lvl>
+    <w:lvl w:ilvl="1" w:tplc="04090003" w:tentative="1">
+      <w:start w:val="1"/>
+      <w:numFmt w:val="bullet"/>
+      <w:lvlText w:val="o"/>
+      <w:lvlJc w:val="left"/>
+      <w:pPr>
+        <w:ind w:left="1800" w:hanging="360"/>
+      </w:pPr>
+      <w:rPr>
+        <w:rFonts w:ascii="Courier New" w:hAnsi="Courier New" w:cs="Courier New" w:hint="default"/>
+      </w:rPr>
+    </w:lvl>
+    <w:lvl w:ilvl="2" w:tplc="04090005" w:tentative="1">
+      <w:start w:val="1"/>
+      <w:numFmt w:val="bullet"/>
+      <w:lvlText w:val=""/>
+      <w:lvlJc w:val="left"/>
+      <w:pPr>
+        <w:ind w:left="2520" w:hanging="360"/>
+      </w:pPr>
+      <w:rPr>
+        <w:rFonts w:ascii="Wingdings" w:hAnsi="Wingdings" w:hint="default"/>
+      </w:rPr>
+    </w:lvl>
+    <w:lvl w:ilvl="3" w:tplc="04090001" w:tentative="1">
+      <w:start w:val="1"/>
+      <w:numFmt w:val="bullet"/>
+      <w:lvlText w:val=""/>
+      <w:lvlJc w:val="left"/>
+      <w:pPr>
+        <w:ind w:left="3240" w:hanging="360"/>
+      </w:pPr>
+      <w:rPr>
+        <w:rFonts w:ascii="Symbol" w:hAnsi="Symbol" w:hint="default"/>
+      </w:rPr>
+    </w:lvl>
+    <w:lvl w:ilvl="4" w:tplc="04090003" w:tentative="1">
+      <w:start w:val="1"/>
+      <w:numFmt w:val="bullet"/>
+      <w:lvlText w:val="o"/>
+      <w:lvlJc w:val="left"/>
+      <w:pPr>
+        <w:ind w:left="3960" w:hanging="360"/>
+      </w:pPr>
+      <w:rPr>
+        <w:rFonts w:ascii="Courier New" w:hAnsi="Courier New" w:cs="Courier New" w:hint="default"/>
+      </w:rPr>
+    </w:lvl>
+    <w:lvl w:ilvl="5" w:tplc="04090005" w:tentative="1">
+      <w:start w:val="1"/>
+      <w:numFmt w:val="bullet"/>
+      <w:lvlText w:val=""/>
+      <w:lvlJc w:val="left"/>
+      <w:pPr>
+        <w:ind w:left="4680" w:hanging="360"/>
+      </w:pPr>
+      <w:rPr>
+        <w:rFonts w:ascii="Wingdings" w:hAnsi="Wingdings" w:hint="default"/>
+      </w:rPr>
+    </w:lvl>
+    <w:lvl w:ilvl="6" w:tplc="04090001" w:tentative="1">
+      <w:start w:val="1"/>
+      <w:numFmt w:val="bullet"/>
+      <w:lvlText w:val=""/>
+      <w:lvlJc w:val="left"/>
+      <w:pPr>
+        <w:ind w:left="5400" w:hanging="360"/>
+      </w:pPr>
+      <w:rPr>
+        <w:rFonts w:ascii="Symbol" w:hAnsi="Symbol" w:hint="default"/>
+      </w:rPr>
+    </w:lvl>
+    <w:lvl w:ilvl="7" w:tplc="04090003" w:tentative="1">
+      <w:start w:val="1"/>
+      <w:numFmt w:val="bullet"/>
+      <w:lvlText w:val="o"/>
+      <w:lvlJc w:val="left"/>
+      <w:pPr>
+        <w:ind w:left="6120" w:hanging="360"/>
+      </w:pPr>
+      <w:rPr>
+        <w:rFonts w:ascii="Courier New" w:hAnsi="Courier New" w:cs="Courier New" w:hint="default"/>
+      </w:rPr>
+    </w:lvl>
+    <w:lvl w:ilvl="8" w:tplc="04090005" w:tentative="1">
+      <w:start w:val="1"/>
+      <w:numFmt w:val="bullet"/>
+      <w:lvlText w:val=""/>
+      <w:lvlJc w:val="left"/>
+      <w:pPr>
+        <w:ind w:left="6840" w:hanging="360"/>
+      </w:pPr>
+      <w:rPr>
+        <w:rFonts w:ascii="Wingdings" w:hAnsi="Wingdings" w:hint="default"/>
+      </w:rPr>
+    </w:lvl>
+  </w:abstractNum>
+  <w:num w:numId="1" w16cid:durableId="1132019881">
+    <w:abstractNumId w:val="5"/>
+  </w:num>
+  <w:num w:numId="2" w16cid:durableId="643657395">
+    <w:abstractNumId w:val="1"/>
+  </w:num>
+  <w:num w:numId="3" w16cid:durableId="1887377473">
+    <w:abstractNumId w:val="3"/>
+  </w:num>
+  <w:num w:numId="4" w16cid:durableId="1285966835">
+    <w:abstractNumId w:val="0"/>
+  </w:num>
+  <w:num w:numId="5" w16cid:durableId="330106461">
+    <w:abstractNumId w:val="4"/>
+  </w:num>
+  <w:num w:numId="6" w16cid:durableId="2025277540">
+    <w:abstractNumId w:val="7"/>
+  </w:num>
+  <w:num w:numId="7" w16cid:durableId="487745498">
+    <w:abstractNumId w:val="8"/>
+  </w:num>
+  <w:num w:numId="8" w16cid:durableId="1837576449">
+    <w:abstractNumId w:val="6"/>
+  </w:num>
+  <w:num w:numId="9" w16cid:durableId="2057658846">
+    <w:abstractNumId w:val="2"/>
+  </w:num>
+  <w:num w:numId="10" w16cid:durableId="890578668">
+    <w:abstractNumId w:val="9"/>
+  </w:num>
+</w:numbering>
 </file>
 
 <file path=word/styles.xml><?xml version="1.0" encoding="utf-8"?>
@@ -395,13 +2203,57 @@
     <w:lsdException w:name="HTML Sample" w:semiHidden="1" w:unhideWhenUsed="1"/>
     <w:lsdException w:name="HTML Typewriter" w:semiHidden="1" w:unhideWhenUsed="1"/>
     <w:lsdException w:name="HTML Variable" w:semiHidden="1" w:unhideWhenUsed="1"/>
+    <w:lsdException w:name="Normal Table" w:semiHidden="1" w:unhideWhenUsed="1"/>
     <w:lsdException w:name="annotation subject" w:semiHidden="1" w:unhideWhenUsed="1"/>
     <w:lsdException w:name="No List" w:semiHidden="1" w:unhideWhenUsed="1"/>
     <w:lsdException w:name="Outline List 1" w:semiHidden="1" w:unhideWhenUsed="1"/>
     <w:lsdException w:name="Outline List 2" w:semiHidden="1" w:unhideWhenUsed="1"/>
     <w:lsdException w:name="Outline List 3" w:semiHidden="1" w:unhideWhenUsed="1"/>
+    <w:lsdException w:name="Table Simple 1" w:semiHidden="1" w:unhideWhenUsed="1"/>
+    <w:lsdException w:name="Table Simple 2" w:semiHidden="1" w:unhideWhenUsed="1"/>
+    <w:lsdException w:name="Table Simple 3" w:semiHidden="1" w:unhideWhenUsed="1"/>
+    <w:lsdException w:name="Table Classic 1" w:semiHidden="1" w:unhideWhenUsed="1"/>
+    <w:lsdException w:name="Table Classic 2" w:semiHidden="1" w:unhideWhenUsed="1"/>
+    <w:lsdException w:name="Table Classic 3" w:semiHidden="1" w:unhideWhenUsed="1"/>
+    <w:lsdException w:name="Table Classic 4" w:semiHidden="1" w:unhideWhenUsed="1"/>
+    <w:lsdException w:name="Table Colorful 1" w:semiHidden="1" w:unhideWhenUsed="1"/>
+    <w:lsdException w:name="Table Colorful 2" w:semiHidden="1" w:unhideWhenUsed="1"/>
+    <w:lsdException w:name="Table Colorful 3" w:semiHidden="1" w:unhideWhenUsed="1"/>
+    <w:lsdException w:name="Table Columns 1" w:semiHidden="1" w:unhideWhenUsed="1"/>
+    <w:lsdException w:name="Table Columns 2" w:semiHidden="1" w:unhideWhenUsed="1"/>
+    <w:lsdException w:name="Table Columns 3" w:semiHidden="1" w:unhideWhenUsed="1"/>
+    <w:lsdException w:name="Table Columns 4" w:semiHidden="1" w:unhideWhenUsed="1"/>
+    <w:lsdException w:name="Table Columns 5" w:semiHidden="1" w:unhideWhenUsed="1"/>
+    <w:lsdException w:name="Table Grid 1" w:semiHidden="1" w:unhideWhenUsed="1"/>
+    <w:lsdException w:name="Table Grid 2" w:semiHidden="1" w:unhideWhenUsed="1"/>
+    <w:lsdException w:name="Table Grid 3" w:semiHidden="1" w:unhideWhenUsed="1"/>
+    <w:lsdException w:name="Table Grid 4" w:semiHidden="1" w:unhideWhenUsed="1"/>
+    <w:lsdException w:name="Table Grid 5" w:semiHidden="1" w:unhideWhenUsed="1"/>
+    <w:lsdException w:name="Table Grid 6" w:semiHidden="1" w:unhideWhenUsed="1"/>
+    <w:lsdException w:name="Table Grid 7" w:semiHidden="1" w:unhideWhenUsed="1"/>
+    <w:lsdException w:name="Table Grid 8" w:semiHidden="1" w:unhideWhenUsed="1"/>
+    <w:lsdException w:name="Table List 1" w:semiHidden="1" w:unhideWhenUsed="1"/>
+    <w:lsdException w:name="Table List 2" w:semiHidden="1" w:unhideWhenUsed="1"/>
+    <w:lsdException w:name="Table List 3" w:semiHidden="1" w:unhideWhenUsed="1"/>
+    <w:lsdException w:name="Table List 4" w:semiHidden="1" w:unhideWhenUsed="1"/>
+    <w:lsdException w:name="Table List 5" w:semiHidden="1" w:unhideWhenUsed="1"/>
+    <w:lsdException w:name="Table List 6" w:semiHidden="1" w:unhideWhenUsed="1"/>
+    <w:lsdException w:name="Table List 7" w:semiHidden="1" w:unhideWhenUsed="1"/>
+    <w:lsdException w:name="Table List 8" w:semiHidden="1" w:unhideWhenUsed="1"/>
+    <w:lsdException w:name="Table 3D effects 1" w:semiHidden="1" w:unhideWhenUsed="1"/>
+    <w:lsdException w:name="Table 3D effects 2" w:semiHidden="1" w:unhideWhenUsed="1"/>
+    <w:lsdException w:name="Table 3D effects 3" w:semiHidden="1" w:unhideWhenUsed="1"/>
+    <w:lsdException w:name="Table Contemporary" w:semiHidden="1" w:unhideWhenUsed="1"/>
+    <w:lsdException w:name="Table Elegant" w:semiHidden="1" w:unhideWhenUsed="1"/>
+    <w:lsdException w:name="Table Professional" w:semiHidden="1" w:unhideWhenUsed="1"/>
+    <w:lsdException w:name="Table Subtle 1" w:semiHidden="1" w:unhideWhenUsed="1"/>
+    <w:lsdException w:name="Table Subtle 2" w:semiHidden="1" w:unhideWhenUsed="1"/>
+    <w:lsdException w:name="Table Web 1" w:semiHidden="1" w:unhideWhenUsed="1"/>
+    <w:lsdException w:name="Table Web 2" w:semiHidden="1" w:unhideWhenUsed="1"/>
+    <w:lsdException w:name="Table Web 3" w:semiHidden="1" w:unhideWhenUsed="1"/>
     <w:lsdException w:name="Balloon Text" w:semiHidden="1" w:unhideWhenUsed="1"/>
     <w:lsdException w:name="Table Grid" w:uiPriority="39"/>
+    <w:lsdException w:name="Table Theme" w:semiHidden="1" w:unhideWhenUsed="1"/>
     <w:lsdException w:name="Placeholder Text" w:semiHidden="1"/>
     <w:lsdException w:name="No Spacing" w:uiPriority="1" w:qFormat="1"/>
     <w:lsdException w:name="Light Shading" w:uiPriority="60"/>
@@ -633,6 +2485,7 @@
   <w:style w:type="character" w:default="1" w:styleId="DefaultParagraphFont">
     <w:name w:val="Default Paragraph Font"/>
     <w:uiPriority w:val="1"/>
+    <w:semiHidden/>
     <w:unhideWhenUsed/>
   </w:style>
   <w:style w:type="table" w:default="1" w:styleId="TableNormal">
@@ -655,6 +2508,17 @@
     <w:uiPriority w:val="99"/>
     <w:semiHidden/>
     <w:unhideWhenUsed/>
+  </w:style>
+  <w:style w:type="paragraph" w:styleId="ListParagraph">
+    <w:name w:val="List Paragraph"/>
+    <w:basedOn w:val="Normal"/>
+    <w:uiPriority w:val="34"/>
+    <w:qFormat/>
+    <w:rsid w:val="00990C19"/>
+    <w:pPr>
+      <w:ind w:left="720"/>
+      <w:contextualSpacing/>
+    </w:pPr>
   </w:style>
 </w:styles>
 </file>

</xml_diff>